<commit_message>
Separate chamber and flux tower projects
</commit_message>
<xml_diff>
--- a/Yijia_8-Minute_Presentation_Script.docx
+++ b/Yijia_8-Minute_Presentation_Script.docx
@@ -43,7 +43,7 @@
           <w:color w:val="666666"/>
           <w:sz w:val="22"/>
         </w:rPr>
-        <w:t>Yijia (Ricardo) Xie  |  10 slides  |  approximately 829 words</w:t>
+        <w:t>Yijia (Ricardo) Xie  |  10 slides  |  approximately 825 words</w:t>
       </w:r>
     </w:p>
     <w:p>
@@ -295,7 +295,7 @@
           <w:rFonts w:ascii="Calibri" w:hAnsi="Calibri"/>
           <w:sz w:val="22"/>
         </w:rPr>
-        <w:t>The UBC Micrometeorology Lab was my first sustained research experience. At Burns Bog, I worked with portable chambers used to measure carbon dioxide and methane fluxes at plot scale. At the CA-DSM and CA-RBM wetland sites, I assisted with eddy-covariance system maintenance and calibration and became familiar with flux-data quality control. This was where carbon and water exchange became a real process for me. A flux value reflects vegetation, water conditions, meteorology, instrumentation, and the footprint represented by the tower. That experience is the strongest direct connection between my background and this PhD.</w:t>
+        <w:t>The UBC Micrometeorology Lab was my first sustained research experience. At Burns Bog, I supported a study examining how pine seedling removal after fire affected ecosystem respiration and methane fluxes. We used non-steady-state portable chamber-analyser measurements across treatment sites. In a separate project at the CA-DSM and CA-RBM wetlands, I assisted with eddy-covariance system maintenance and calibration. Together, these projects let me see carbon exchange at two scales: targeted plot measurements and continuous ecosystem-scale observations. They are the strongest direct connection between my background and this PhD.</w:t>
       </w:r>
     </w:p>
     <w:p>

</xml_diff>